<commit_message>
Finalized Class Diagram + Edited Layout
</commit_message>
<xml_diff>
--- a/DSD.docx
+++ b/DSD.docx
@@ -969,8 +969,12 @@
             </w:pPr>
             <w:r>
               <w:rPr>
+                <w:rFonts w:ascii="Times New Roman" w:cs="Times New Roman" w:eastAsia="Times New Roman" w:hAnsi="Times New Roman"/>
+                <w:sz w:val="20"/>
+                <w:szCs w:val="20"/>
                 <w:rtl w:val="0"/>
               </w:rPr>
+              <w:t xml:space="preserve">04/06/2026</w:t>
             </w:r>
           </w:p>
         </w:tc>
@@ -995,8 +999,12 @@
             </w:pPr>
             <w:r>
               <w:rPr>
+                <w:rFonts w:ascii="Times New Roman" w:cs="Times New Roman" w:eastAsia="Times New Roman" w:hAnsi="Times New Roman"/>
+                <w:sz w:val="20"/>
+                <w:szCs w:val="20"/>
                 <w:rtl w:val="0"/>
               </w:rPr>
+              <w:t xml:space="preserve">2.0</w:t>
             </w:r>
           </w:p>
         </w:tc>
@@ -1021,8 +1029,12 @@
             </w:pPr>
             <w:r>
               <w:rPr>
+                <w:rFonts w:ascii="Times New Roman" w:cs="Times New Roman" w:eastAsia="Times New Roman" w:hAnsi="Times New Roman"/>
+                <w:sz w:val="20"/>
+                <w:szCs w:val="20"/>
                 <w:rtl w:val="0"/>
               </w:rPr>
+              <w:t xml:space="preserve">Edited + Finalized Class Diagram</w:t>
             </w:r>
           </w:p>
         </w:tc>
@@ -1048,8 +1060,12 @@
             </w:pPr>
             <w:r>
               <w:rPr>
+                <w:rFonts w:ascii="Times New Roman" w:cs="Times New Roman" w:eastAsia="Times New Roman" w:hAnsi="Times New Roman"/>
+                <w:sz w:val="20"/>
+                <w:szCs w:val="20"/>
                 <w:rtl w:val="0"/>
               </w:rPr>
+              <w:t xml:space="preserve">Sadhvik Chelmatikary</w:t>
             </w:r>
           </w:p>
         </w:tc>
@@ -1080,8 +1096,12 @@
             </w:pPr>
             <w:r>
               <w:rPr>
+                <w:rFonts w:ascii="Times New Roman" w:cs="Times New Roman" w:eastAsia="Times New Roman" w:hAnsi="Times New Roman"/>
+                <w:sz w:val="20"/>
+                <w:szCs w:val="20"/>
                 <w:rtl w:val="0"/>
               </w:rPr>
+              <w:t xml:space="preserve">04/06/2026</w:t>
             </w:r>
           </w:p>
         </w:tc>
@@ -1106,8 +1126,12 @@
             </w:pPr>
             <w:r>
               <w:rPr>
+                <w:rFonts w:ascii="Times New Roman" w:cs="Times New Roman" w:eastAsia="Times New Roman" w:hAnsi="Times New Roman"/>
+                <w:sz w:val="20"/>
+                <w:szCs w:val="20"/>
                 <w:rtl w:val="0"/>
               </w:rPr>
+              <w:t xml:space="preserve">2.1</w:t>
             </w:r>
           </w:p>
         </w:tc>
@@ -1132,8 +1156,12 @@
             </w:pPr>
             <w:r>
               <w:rPr>
+                <w:rFonts w:ascii="Times New Roman" w:cs="Times New Roman" w:eastAsia="Times New Roman" w:hAnsi="Times New Roman"/>
+                <w:sz w:val="20"/>
+                <w:szCs w:val="20"/>
                 <w:rtl w:val="0"/>
               </w:rPr>
+              <w:t xml:space="preserve">Edited Layout of Class Diagram</w:t>
             </w:r>
           </w:p>
         </w:tc>
@@ -1159,8 +1187,12 @@
             </w:pPr>
             <w:r>
               <w:rPr>
+                <w:rFonts w:ascii="Times New Roman" w:cs="Times New Roman" w:eastAsia="Times New Roman" w:hAnsi="Times New Roman"/>
+                <w:sz w:val="20"/>
+                <w:szCs w:val="20"/>
                 <w:rtl w:val="0"/>
               </w:rPr>
+              <w:t xml:space="preserve">Nikki Ong</w:t>
             </w:r>
           </w:p>
         </w:tc>
@@ -2798,7 +2830,7 @@
     </w:p>
     <w:sdt>
       <w:sdtPr>
-        <w:id w:val="2099664943"/>
+        <w:id w:val="-386257268"/>
         <w:docPartObj>
           <w:docPartGallery w:val="Table of Contents"/>
           <w:docPartUnique w:val="1"/>
@@ -4219,12 +4251,12 @@
             <wp:extent cx="3548063" cy="2965958"/>
             <wp:effectExtent b="0" l="0" r="0" t="0"/>
             <wp:wrapSquare wrapText="bothSides" distB="114300" distT="114300" distL="114300" distR="114300"/>
-            <wp:docPr id="4" name="image1.png"/>
+            <wp:docPr id="4" name="image2.png"/>
             <a:graphic>
               <a:graphicData uri="http://schemas.openxmlformats.org/drawingml/2006/picture">
                 <pic:pic>
                   <pic:nvPicPr>
-                    <pic:cNvPr id="0" name="image1.png"/>
+                    <pic:cNvPr id="0" name="image2.png"/>
                     <pic:cNvPicPr preferRelativeResize="0"/>
                   </pic:nvPicPr>
                   <pic:blipFill>
@@ -4489,12 +4521,12 @@
             <wp:extent cx="3586494" cy="2999963"/>
             <wp:effectExtent b="0" l="0" r="0" t="0"/>
             <wp:wrapSquare wrapText="bothSides" distB="114300" distT="114300" distL="114300" distR="114300"/>
-            <wp:docPr id="2" name="image4.png"/>
+            <wp:docPr id="2" name="image5.png"/>
             <a:graphic>
               <a:graphicData uri="http://schemas.openxmlformats.org/drawingml/2006/picture">
                 <pic:pic>
                   <pic:nvPicPr>
-                    <pic:cNvPr id="0" name="image4.png"/>
+                    <pic:cNvPr id="0" name="image5.png"/>
                     <pic:cNvPicPr preferRelativeResize="0"/>
                   </pic:nvPicPr>
                   <pic:blipFill>
@@ -5042,12 +5074,12 @@
             <wp:extent cx="3148013" cy="4031839"/>
             <wp:effectExtent b="0" l="0" r="0" t="0"/>
             <wp:wrapSquare wrapText="bothSides" distB="114300" distT="114300" distL="114300" distR="114300"/>
-            <wp:docPr id="3" name="image6.png"/>
+            <wp:docPr id="3" name="image1.png"/>
             <a:graphic>
               <a:graphicData uri="http://schemas.openxmlformats.org/drawingml/2006/picture">
                 <pic:pic>
                   <pic:nvPicPr>
-                    <pic:cNvPr id="0" name="image6.png"/>
+                    <pic:cNvPr id="0" name="image1.png"/>
                     <pic:cNvPicPr preferRelativeResize="0"/>
                   </pic:nvPicPr>
                   <pic:blipFill>
@@ -12888,12 +12920,12 @@
           <wp:inline distB="114300" distT="114300" distL="114300" distR="114300">
             <wp:extent cx="5943600" cy="4241800"/>
             <wp:effectExtent b="0" l="0" r="0" t="0"/>
-            <wp:docPr id="6" name="image5.png"/>
+            <wp:docPr id="7" name="image6.png"/>
             <a:graphic>
               <a:graphicData uri="http://schemas.openxmlformats.org/drawingml/2006/picture">
                 <pic:pic>
                   <pic:nvPicPr>
-                    <pic:cNvPr id="0" name="image5.png"/>
+                    <pic:cNvPr id="0" name="image6.png"/>
                     <pic:cNvPicPr preferRelativeResize="0"/>
                   </pic:nvPicPr>
                   <pic:blipFill>
@@ -12956,6 +12988,7 @@
     <w:p>
       <w:pPr>
         <w:spacing w:after="180" w:lineRule="auto"/>
+        <w:jc w:val="center"/>
         <w:rPr/>
       </w:pPr>
       <w:r>
@@ -12965,14 +12998,14 @@
         </w:rPr>
         <w:drawing>
           <wp:inline distB="114300" distT="114300" distL="114300" distR="114300">
-            <wp:extent cx="4351564" cy="7615238"/>
+            <wp:extent cx="6672263" cy="7565960"/>
             <wp:effectExtent b="0" l="0" r="0" t="0"/>
-            <wp:docPr id="7" name="image2.png"/>
+            <wp:docPr id="6" name="image7.png"/>
             <a:graphic>
               <a:graphicData uri="http://schemas.openxmlformats.org/drawingml/2006/picture">
                 <pic:pic>
                   <pic:nvPicPr>
-                    <pic:cNvPr id="0" name="image2.png"/>
+                    <pic:cNvPr id="0" name="image7.png"/>
                     <pic:cNvPicPr preferRelativeResize="0"/>
                   </pic:nvPicPr>
                   <pic:blipFill>
@@ -12985,7 +13018,7 @@
                   <pic:spPr>
                     <a:xfrm>
                       <a:off x="0" y="0"/>
-                      <a:ext cx="4351564" cy="7615238"/>
+                      <a:ext cx="6672263" cy="7565960"/>
                     </a:xfrm>
                     <a:prstGeom prst="rect"/>
                     <a:ln/>
@@ -14726,12 +14759,12 @@
               <wp:inline distB="114300" distT="114300" distL="114300" distR="114300">
                 <wp:extent cx="5943600" cy="4676215"/>
                 <wp:effectExtent b="0" l="0" r="0" t="0"/>
-                <wp:docPr id="1" name="image7.png"/>
+                <wp:docPr id="1" name="image4.png"/>
                 <a:graphic>
                   <a:graphicData uri="http://schemas.openxmlformats.org/drawingml/2006/picture">
                     <pic:pic>
                       <pic:nvPicPr>
-                        <pic:cNvPr id="0" name="image7.png"/>
+                        <pic:cNvPr id="0" name="image4.png"/>
                         <pic:cNvPicPr preferRelativeResize="0"/>
                       </pic:nvPicPr>
                       <pic:blipFill>

</xml_diff>